<commit_message>
I’ve regenerated the resume outputs from the updated source so the PDFs/markdown stay in sync, and now I’m verifying the exact before/after wording and touched files for your report.
</commit_message>
<xml_diff>
--- a/outputs/resume_full.docx
+++ b/outputs/resume_full.docx
@@ -759,7 +759,7 @@
           <w:b/>
           <w:sz w:val="21"/>
         </w:rPr>
-        <w:t>Volunteer, Fifth-Grade Classroom &amp; Special Education Support | Capistrano Unified School District, Riley Elementary | Capistrano Valley, CA | June 2013 – March 2016</w:t>
+        <w:t>Elementary Classroom &amp; Special Education Support (Volunteer) | Capistrano Unified School District, Riley Elementary | Capistrano Valley, CA | June 2013 – March 2016</w:t>
       </w:r>
     </w:p>
     <w:p>
@@ -779,7 +779,7 @@
           <w:rFonts w:ascii="Calibri" w:hAnsi="Calibri"/>
           <w:sz w:val="21"/>
         </w:rPr>
-        <w:t>Volunteered in fifth grade during a career pivot, reinforcing lessons and routines beside the classroom teacher.</w:t>
+        <w:t>Volunteer role during a transition back to district special education work while advancing graduate/credential preparation at Chapman.</w:t>
       </w:r>
     </w:p>
     <w:p>

</xml_diff>

<commit_message>
Done — I made exactly that role-level update in the Professional Experience section and propagated it through generated resumes.
Updated as requested
Role title is now:
Graduate Study & Special Education Classroom Support
(Volunteer role) removed from the role header/subheader line.
School + dates unchanged:
Capistrano Unified School District, Riley Elementary · Capistrano Valley, CA · June 2013–March 2016
Replaced prior bullets with one bullet:
Completed graduate study in Special Education at Chapman University while supporting fifth-grade and special education classrooms through instructional rotations and weekly reading probes that informed intervention adjustments.
</commit_message>
<xml_diff>
--- a/outputs/resume_full.docx
+++ b/outputs/resume_full.docx
@@ -759,7 +759,7 @@
           <w:b/>
           <w:sz w:val="21"/>
         </w:rPr>
-        <w:t>Elementary Classroom &amp; Special Education Support | Capistrano Unified School District, Riley Elementary | Capistrano Valley, CA | June 2013 – March 2016 (Volunteer role)</w:t>
+        <w:t>Graduate Study &amp; Special Education Classroom Support | Capistrano Unified School District, Riley Elementary | Capistrano Valley, CA | June 2013 – March 2016</w:t>
       </w:r>
     </w:p>
     <w:p>
@@ -779,7 +779,7 @@
           <w:rFonts w:ascii="Calibri" w:hAnsi="Calibri"/>
           <w:sz w:val="21"/>
         </w:rPr>
-        <w:t>During a transition back to district special education work while advancing graduate/credential preparation at Chapman, supported fifth-grade and special education classrooms with grade-wide instructional rotations and weekly reading probes used to adjust interventions.</w:t>
+        <w:t>Completed graduate study in Special Education at Chapman University while supporting fifth-grade and special education classrooms through instructional rotations and weekly reading probes that informed intervention adjustments.</w:t>
       </w:r>
     </w:p>
     <w:p>

</xml_diff>